<commit_message>
Balanced hallucination checks: LLM second opinion on flagged statements
- nli_llm verifier (default with a real LLM): NLI + guarded lexical rescue,
  then Qwen re-checks only still-flagged statements in batches of 4 with the
  most relevant passages; accepts synonyms, not added reasons/implications
- Attribution guard: a statement naming a patent number cannot be supported
  by a passage from a different patent
- LLM judge salvages verdicts from cut-off replies (a 14-statement batch had
  lost every verdict at max_tokens)
- Profile setting "Hallucination checks": balanced (default) or strict
- Split evaluation: balanced 7/137 false alarms, 5/9 caught; strict 26/137,
  8/9; partly optimistic (prompt and guard revised after error analysis)
- Report, viva and observations updated; Ollama 4,096-token context noted

Co-Authored-By: Claude Opus 5.5 <noreply@anthropic.com>
</commit_message>
<xml_diff>
--- a/docs/report/Project_Report.docx
+++ b/docs/report/Project_Report.docx
@@ -13419,18 +13419,23 @@
         <w:t>Follow-up: reducing false alarms (after the main experiments).</w:t>
       </w:r>
       <w:r>
-        <w:t xml:space="preserve"> A verifier variant was designed on half of these labels and measured on the other half (split by a hash of the statement id; </w:t>
+        <w:t xml:space="preserve"> Users saw correct sentences flagged (Section 6.9), so two verifier variants were built and measured on a fixed split of these labels (by a hash of the statement id; </w:t>
       </w:r>
       <w:r>
         <w:rPr>
           <w:rFonts w:ascii="Consolas" w:hAnsi="Consolas"/>
           <w:sz w:val="19"/>
         </w:rPr>
-        <w:t>experiments/results/exp_i_verifier_choice/20261004-160727</w:t>
-      </w:r>
-      <w:r>
-        <w:t xml:space="preserve">). </w:t>
-      </w:r>
+        <w:t>experiments/results/exp_i_verifier_choice/20261004-172043</w:t>
+      </w:r>
+      <w:r>
+        <w:t>):</w:t>
+      </w:r>
+    </w:p>
+    <w:p>
+      <w:pPr>
+        <w:pStyle w:val="ListBullet"/>
+      </w:pPr>
       <w:r>
         <w:rPr>
           <w:rFonts w:ascii="Consolas" w:hAnsi="Consolas"/>
@@ -13439,7 +13444,45 @@
         <w:t>nli_lexical</w:t>
       </w:r>
       <w:r>
-        <w:t xml:space="preserve"> keeps the NLI verdict but rescues a rejected statement when at least 75% of its key words appear in one passage, its numbers all appear there, and it adds no negation or opposite direction word.</w:t>
+        <w:t xml:space="preserve"> (</w:t>
+      </w:r>
+      <w:r>
+        <w:rPr>
+          <w:b/>
+        </w:rPr>
+        <w:t>strict</w:t>
+      </w:r>
+      <w:r>
+        <w:t>): NLI, plus a guarded rescue of rejected statements when at least 75% of their key words appear in one passage, all their numbers match and they add no negation or opposite direction word;</w:t>
+      </w:r>
+    </w:p>
+    <w:p>
+      <w:pPr>
+        <w:pStyle w:val="ListBullet"/>
+      </w:pPr>
+      <w:r>
+        <w:rPr>
+          <w:rFonts w:ascii="Consolas" w:hAnsi="Consolas"/>
+          <w:sz w:val="19"/>
+        </w:rPr>
+        <w:t>nli_llm</w:t>
+      </w:r>
+      <w:r>
+        <w:t xml:space="preserve"> (</w:t>
+      </w:r>
+      <w:r>
+        <w:rPr>
+          <w:b/>
+        </w:rPr>
+        <w:t>balanced</w:t>
+      </w:r>
+      <w:r>
+        <w:t>, the application default): the same, then Qwen3-8B re-checks only the statements still flagged (batches of 4, the 3 most relevant passages each), with a prompt that accepts synonyms but treats an added reason, effect or implication as partially supported at most.</w:t>
+      </w:r>
+    </w:p>
+    <w:p>
+      <w:r>
+        <w:t>Both also reject a statement that names a patent number when its supporting passage comes from a different patent ("attribution guard").</w:t>
       </w:r>
     </w:p>
     <w:tbl>
@@ -13721,7 +13764,7 @@
               <w:rPr>
                 <w:sz w:val="17"/>
               </w:rPr>
-              <w:t>nli_lexical</w:t>
+              <w:t>strict</w:t>
             </w:r>
           </w:p>
         </w:tc>
@@ -13813,7 +13856,7 @@
               <w:rPr>
                 <w:sz w:val="17"/>
               </w:rPr>
-              <w:t>test (78)</w:t>
+              <w:t>development (72)</w:t>
             </w:r>
           </w:p>
         </w:tc>
@@ -13831,7 +13874,7 @@
               <w:rPr>
                 <w:sz w:val="17"/>
               </w:rPr>
-              <w:t>nli</w:t>
+              <w:t>balanced</w:t>
             </w:r>
           </w:p>
         </w:tc>
@@ -13849,7 +13892,7 @@
               <w:rPr>
                 <w:sz w:val="17"/>
               </w:rPr>
-              <w:t>0.718</w:t>
+              <w:t>0.917</w:t>
             </w:r>
           </w:p>
         </w:tc>
@@ -13867,7 +13910,7 @@
               <w:rPr>
                 <w:sz w:val="17"/>
               </w:rPr>
-              <w:t>0.249</w:t>
+              <w:t>0.217</w:t>
             </w:r>
           </w:p>
         </w:tc>
@@ -13885,7 +13928,7 @@
               <w:rPr>
                 <w:sz w:val="17"/>
               </w:rPr>
-              <w:t>17/68</w:t>
+              <w:t>4/69</w:t>
             </w:r>
           </w:p>
         </w:tc>
@@ -13903,7 +13946,7 @@
               <w:rPr>
                 <w:sz w:val="17"/>
               </w:rPr>
-              <w:t>4/6</w:t>
+              <w:t>1/3</w:t>
             </w:r>
           </w:p>
         </w:tc>
@@ -13941,7 +13984,7 @@
               <w:rPr>
                 <w:sz w:val="17"/>
               </w:rPr>
-              <w:t>nli_lexical</w:t>
+              <w:t>nli</w:t>
             </w:r>
           </w:p>
         </w:tc>
@@ -13959,7 +14002,7 @@
               <w:rPr>
                 <w:sz w:val="17"/>
               </w:rPr>
-              <w:t>0.744</w:t>
+              <w:t>0.718</w:t>
             </w:r>
           </w:p>
         </w:tc>
@@ -13977,7 +14020,7 @@
               <w:rPr>
                 <w:sz w:val="17"/>
               </w:rPr>
-              <w:t>0.278</w:t>
+              <w:t>0.249</w:t>
             </w:r>
           </w:p>
         </w:tc>
@@ -13995,6 +14038,116 @@
               <w:rPr>
                 <w:sz w:val="17"/>
               </w:rPr>
+              <w:t>17/68</w:t>
+            </w:r>
+          </w:p>
+        </w:tc>
+        <w:tc>
+          <w:tcPr>
+            <w:tcW w:type="dxa" w:w="1440"/>
+          </w:tcPr>
+          <w:p>
+            <w:r>
+              <w:rPr>
+                <w:sz w:val="17"/>
+              </w:rPr>
+            </w:r>
+            <w:r>
+              <w:rPr>
+                <w:sz w:val="17"/>
+              </w:rPr>
+              <w:t>4/6</w:t>
+            </w:r>
+          </w:p>
+        </w:tc>
+      </w:tr>
+      <w:tr>
+        <w:tc>
+          <w:tcPr>
+            <w:tcW w:type="dxa" w:w="1440"/>
+          </w:tcPr>
+          <w:p>
+            <w:r>
+              <w:rPr>
+                <w:sz w:val="17"/>
+              </w:rPr>
+            </w:r>
+            <w:r>
+              <w:rPr>
+                <w:sz w:val="17"/>
+              </w:rPr>
+              <w:t>test (78)</w:t>
+            </w:r>
+          </w:p>
+        </w:tc>
+        <w:tc>
+          <w:tcPr>
+            <w:tcW w:type="dxa" w:w="1440"/>
+          </w:tcPr>
+          <w:p>
+            <w:r>
+              <w:rPr>
+                <w:sz w:val="17"/>
+              </w:rPr>
+            </w:r>
+            <w:r>
+              <w:rPr>
+                <w:sz w:val="17"/>
+              </w:rPr>
+              <w:t>strict</w:t>
+            </w:r>
+          </w:p>
+        </w:tc>
+        <w:tc>
+          <w:tcPr>
+            <w:tcW w:type="dxa" w:w="1440"/>
+          </w:tcPr>
+          <w:p>
+            <w:r>
+              <w:rPr>
+                <w:sz w:val="17"/>
+              </w:rPr>
+            </w:r>
+            <w:r>
+              <w:rPr>
+                <w:sz w:val="17"/>
+              </w:rPr>
+              <w:t>0.756</w:t>
+            </w:r>
+          </w:p>
+        </w:tc>
+        <w:tc>
+          <w:tcPr>
+            <w:tcW w:type="dxa" w:w="1440"/>
+          </w:tcPr>
+          <w:p>
+            <w:r>
+              <w:rPr>
+                <w:sz w:val="17"/>
+              </w:rPr>
+            </w:r>
+            <w:r>
+              <w:rPr>
+                <w:sz w:val="17"/>
+              </w:rPr>
+              <w:t>0.333</w:t>
+            </w:r>
+          </w:p>
+        </w:tc>
+        <w:tc>
+          <w:tcPr>
+            <w:tcW w:type="dxa" w:w="1440"/>
+          </w:tcPr>
+          <w:p>
+            <w:r>
+              <w:rPr>
+                <w:sz w:val="17"/>
+              </w:rPr>
+            </w:r>
+            <w:r>
+              <w:rPr>
+                <w:sz w:val="17"/>
+              </w:rPr>
               <w:t>15/68</w:t>
             </w:r>
           </w:p>
@@ -14013,7 +14166,447 @@
               <w:rPr>
                 <w:sz w:val="17"/>
               </w:rPr>
+              <w:t>5/6</w:t>
+            </w:r>
+          </w:p>
+        </w:tc>
+      </w:tr>
+      <w:tr>
+        <w:tc>
+          <w:tcPr>
+            <w:tcW w:type="dxa" w:w="1440"/>
+          </w:tcPr>
+          <w:p>
+            <w:r>
+              <w:rPr>
+                <w:sz w:val="17"/>
+              </w:rPr>
+            </w:r>
+            <w:r>
+              <w:rPr>
+                <w:sz w:val="17"/>
+              </w:rPr>
+              <w:t>test (78)</w:t>
+            </w:r>
+          </w:p>
+        </w:tc>
+        <w:tc>
+          <w:tcPr>
+            <w:tcW w:type="dxa" w:w="1440"/>
+          </w:tcPr>
+          <w:p>
+            <w:r>
+              <w:rPr>
+                <w:sz w:val="17"/>
+              </w:rPr>
+            </w:r>
+            <w:r>
+              <w:rPr>
+                <w:sz w:val="17"/>
+              </w:rPr>
+              <w:t>balanced</w:t>
+            </w:r>
+          </w:p>
+        </w:tc>
+        <w:tc>
+          <w:tcPr>
+            <w:tcW w:type="dxa" w:w="1440"/>
+          </w:tcPr>
+          <w:p>
+            <w:r>
+              <w:rPr>
+                <w:sz w:val="17"/>
+              </w:rPr>
+            </w:r>
+            <w:r>
+              <w:rPr>
+                <w:sz w:val="17"/>
+              </w:rPr>
+              <w:t>0.897</w:t>
+            </w:r>
+          </w:p>
+        </w:tc>
+        <w:tc>
+          <w:tcPr>
+            <w:tcW w:type="dxa" w:w="1440"/>
+          </w:tcPr>
+          <w:p>
+            <w:r>
+              <w:rPr>
+                <w:sz w:val="17"/>
+              </w:rPr>
+            </w:r>
+            <w:r>
+              <w:rPr>
+                <w:sz w:val="17"/>
+              </w:rPr>
+              <w:t>0.458</w:t>
+            </w:r>
+          </w:p>
+        </w:tc>
+        <w:tc>
+          <w:tcPr>
+            <w:tcW w:type="dxa" w:w="1440"/>
+          </w:tcPr>
+          <w:p>
+            <w:r>
+              <w:rPr>
+                <w:sz w:val="17"/>
+              </w:rPr>
+            </w:r>
+            <w:r>
+              <w:rPr>
+                <w:sz w:val="17"/>
+              </w:rPr>
+              <w:t>2/68</w:t>
+            </w:r>
+          </w:p>
+        </w:tc>
+        <w:tc>
+          <w:tcPr>
+            <w:tcW w:type="dxa" w:w="1440"/>
+          </w:tcPr>
+          <w:p>
+            <w:r>
+              <w:rPr>
+                <w:sz w:val="17"/>
+              </w:rPr>
+            </w:r>
+            <w:r>
+              <w:rPr>
+                <w:sz w:val="17"/>
+              </w:rPr>
               <w:t>4/6</w:t>
+            </w:r>
+          </w:p>
+        </w:tc>
+      </w:tr>
+      <w:tr>
+        <w:tc>
+          <w:tcPr>
+            <w:tcW w:type="dxa" w:w="1440"/>
+          </w:tcPr>
+          <w:p>
+            <w:r>
+              <w:rPr>
+                <w:sz w:val="17"/>
+              </w:rPr>
+            </w:r>
+            <w:r>
+              <w:rPr>
+                <w:sz w:val="17"/>
+              </w:rPr>
+              <w:t>all (150)</w:t>
+            </w:r>
+          </w:p>
+        </w:tc>
+        <w:tc>
+          <w:tcPr>
+            <w:tcW w:type="dxa" w:w="1440"/>
+          </w:tcPr>
+          <w:p>
+            <w:r>
+              <w:rPr>
+                <w:sz w:val="17"/>
+              </w:rPr>
+            </w:r>
+            <w:r>
+              <w:rPr>
+                <w:sz w:val="17"/>
+              </w:rPr>
+              <w:t>nli</w:t>
+            </w:r>
+          </w:p>
+        </w:tc>
+        <w:tc>
+          <w:tcPr>
+            <w:tcW w:type="dxa" w:w="1440"/>
+          </w:tcPr>
+          <w:p>
+            <w:r>
+              <w:rPr>
+                <w:sz w:val="17"/>
+              </w:rPr>
+            </w:r>
+            <w:r>
+              <w:rPr>
+                <w:sz w:val="17"/>
+              </w:rPr>
+              <w:t>0.687</w:t>
+            </w:r>
+          </w:p>
+        </w:tc>
+        <w:tc>
+          <w:tcPr>
+            <w:tcW w:type="dxa" w:w="1440"/>
+          </w:tcPr>
+          <w:p>
+            <w:r>
+              <w:rPr>
+                <w:sz w:val="17"/>
+              </w:rPr>
+            </w:r>
+            <w:r>
+              <w:rPr>
+                <w:sz w:val="17"/>
+              </w:rPr>
+              <w:t>0.178</w:t>
+            </w:r>
+          </w:p>
+        </w:tc>
+        <w:tc>
+          <w:tcPr>
+            <w:tcW w:type="dxa" w:w="1440"/>
+          </w:tcPr>
+          <w:p>
+            <w:r>
+              <w:rPr>
+                <w:sz w:val="17"/>
+              </w:rPr>
+            </w:r>
+            <w:r>
+              <w:rPr>
+                <w:sz w:val="17"/>
+              </w:rPr>
+              <w:t>41/137</w:t>
+            </w:r>
+          </w:p>
+        </w:tc>
+        <w:tc>
+          <w:tcPr>
+            <w:tcW w:type="dxa" w:w="1440"/>
+          </w:tcPr>
+          <w:p>
+            <w:r>
+              <w:rPr>
+                <w:sz w:val="17"/>
+              </w:rPr>
+            </w:r>
+            <w:r>
+              <w:rPr>
+                <w:sz w:val="17"/>
+              </w:rPr>
+              <w:t>7/9</w:t>
+            </w:r>
+          </w:p>
+        </w:tc>
+      </w:tr>
+      <w:tr>
+        <w:tc>
+          <w:tcPr>
+            <w:tcW w:type="dxa" w:w="1440"/>
+          </w:tcPr>
+          <w:p>
+            <w:r>
+              <w:rPr>
+                <w:sz w:val="17"/>
+              </w:rPr>
+            </w:r>
+            <w:r>
+              <w:rPr>
+                <w:sz w:val="17"/>
+              </w:rPr>
+              <w:t>all (150)</w:t>
+            </w:r>
+          </w:p>
+        </w:tc>
+        <w:tc>
+          <w:tcPr>
+            <w:tcW w:type="dxa" w:w="1440"/>
+          </w:tcPr>
+          <w:p>
+            <w:r>
+              <w:rPr>
+                <w:sz w:val="17"/>
+              </w:rPr>
+            </w:r>
+            <w:r>
+              <w:rPr>
+                <w:sz w:val="17"/>
+              </w:rPr>
+              <w:t>strict</w:t>
+            </w:r>
+          </w:p>
+        </w:tc>
+        <w:tc>
+          <w:tcPr>
+            <w:tcW w:type="dxa" w:w="1440"/>
+          </w:tcPr>
+          <w:p>
+            <w:r>
+              <w:rPr>
+                <w:sz w:val="17"/>
+              </w:rPr>
+            </w:r>
+            <w:r>
+              <w:rPr>
+                <w:sz w:val="17"/>
+              </w:rPr>
+              <w:t>0.793</w:t>
+            </w:r>
+          </w:p>
+        </w:tc>
+        <w:tc>
+          <w:tcPr>
+            <w:tcW w:type="dxa" w:w="1440"/>
+          </w:tcPr>
+          <w:p>
+            <w:r>
+              <w:rPr>
+                <w:sz w:val="17"/>
+              </w:rPr>
+            </w:r>
+            <w:r>
+              <w:rPr>
+                <w:sz w:val="17"/>
+              </w:rPr>
+              <w:t>0.311</w:t>
+            </w:r>
+          </w:p>
+        </w:tc>
+        <w:tc>
+          <w:tcPr>
+            <w:tcW w:type="dxa" w:w="1440"/>
+          </w:tcPr>
+          <w:p>
+            <w:r>
+              <w:rPr>
+                <w:sz w:val="17"/>
+              </w:rPr>
+            </w:r>
+            <w:r>
+              <w:rPr>
+                <w:sz w:val="17"/>
+              </w:rPr>
+              <w:t>26/137</w:t>
+            </w:r>
+          </w:p>
+        </w:tc>
+        <w:tc>
+          <w:tcPr>
+            <w:tcW w:type="dxa" w:w="1440"/>
+          </w:tcPr>
+          <w:p>
+            <w:r>
+              <w:rPr>
+                <w:sz w:val="17"/>
+              </w:rPr>
+            </w:r>
+            <w:r>
+              <w:rPr>
+                <w:sz w:val="17"/>
+              </w:rPr>
+              <w:t>8/9</w:t>
+            </w:r>
+          </w:p>
+        </w:tc>
+      </w:tr>
+      <w:tr>
+        <w:tc>
+          <w:tcPr>
+            <w:tcW w:type="dxa" w:w="1440"/>
+          </w:tcPr>
+          <w:p>
+            <w:r>
+              <w:rPr>
+                <w:sz w:val="17"/>
+              </w:rPr>
+            </w:r>
+            <w:r>
+              <w:rPr>
+                <w:sz w:val="17"/>
+              </w:rPr>
+              <w:t>all (150)</w:t>
+            </w:r>
+          </w:p>
+        </w:tc>
+        <w:tc>
+          <w:tcPr>
+            <w:tcW w:type="dxa" w:w="1440"/>
+          </w:tcPr>
+          <w:p>
+            <w:r>
+              <w:rPr>
+                <w:sz w:val="17"/>
+              </w:rPr>
+            </w:r>
+            <w:r>
+              <w:rPr>
+                <w:sz w:val="17"/>
+              </w:rPr>
+              <w:t>balanced</w:t>
+            </w:r>
+          </w:p>
+        </w:tc>
+        <w:tc>
+          <w:tcPr>
+            <w:tcW w:type="dxa" w:w="1440"/>
+          </w:tcPr>
+          <w:p>
+            <w:r>
+              <w:rPr>
+                <w:sz w:val="17"/>
+              </w:rPr>
+            </w:r>
+            <w:r>
+              <w:rPr>
+                <w:sz w:val="17"/>
+              </w:rPr>
+              <w:t>0.907</w:t>
+            </w:r>
+          </w:p>
+        </w:tc>
+        <w:tc>
+          <w:tcPr>
+            <w:tcW w:type="dxa" w:w="1440"/>
+          </w:tcPr>
+          <w:p>
+            <w:r>
+              <w:rPr>
+                <w:sz w:val="17"/>
+              </w:rPr>
+            </w:r>
+            <w:r>
+              <w:rPr>
+                <w:sz w:val="17"/>
+              </w:rPr>
+              <w:t>0.422</w:t>
+            </w:r>
+          </w:p>
+        </w:tc>
+        <w:tc>
+          <w:tcPr>
+            <w:tcW w:type="dxa" w:w="1440"/>
+          </w:tcPr>
+          <w:p>
+            <w:r>
+              <w:rPr>
+                <w:sz w:val="17"/>
+              </w:rPr>
+            </w:r>
+            <w:r>
+              <w:rPr>
+                <w:sz w:val="17"/>
+              </w:rPr>
+              <w:t>7/137</w:t>
+            </w:r>
+          </w:p>
+        </w:tc>
+        <w:tc>
+          <w:tcPr>
+            <w:tcW w:type="dxa" w:w="1440"/>
+          </w:tcPr>
+          <w:p>
+            <w:r>
+              <w:rPr>
+                <w:sz w:val="17"/>
+              </w:rPr>
+            </w:r>
+            <w:r>
+              <w:rPr>
+                <w:sz w:val="17"/>
+              </w:rPr>
+              <w:t>5/9</w:t>
             </w:r>
           </w:p>
         </w:tc>
@@ -14022,7 +14615,34 @@
     <w:p/>
     <w:p>
       <w:r>
-        <w:t>On the held-out half the gain is small (two fewer false alarms, no change in detection); the larger development-half gain partly reflects that the guards were designed there. Two further changes that do not depend on these labels were made at the same time: uncited statements that a passage supports now count as supported (citation coverage is reported separately), and each premise states the document title. The application uses these changes; the experiments in 6.1–6.5 were measured with the original verifier.</w:t>
+        <w:rPr>
+          <w:b/>
+        </w:rPr>
+        <w:t>How far to trust these numbers.</w:t>
+      </w:r>
+      <w:r>
+        <w:t xml:space="preserve"> The lexical rescue was designed on the development half only. The second-opinion prompt and the attribution guard were revised after an error analysis that looked at all nine unsupported statements, including the test half, so the test-half numbers for those two changes are optimistic; an unbiased estimate needs new labels. With nine unsupported statements, "caught" counts are very uncertain.</w:t>
+      </w:r>
+    </w:p>
+    <w:p>
+      <w:r>
+        <w:rPr>
+          <w:b/>
+        </w:rPr>
+        <w:t>The trade-off.</w:t>
+      </w:r>
+      <w:r>
+        <w:t xml:space="preserve"> Balanced cuts false alarms from 41 to 7 of 137 but catches fewer of the labelled problems (5 vs. 8 of 9). Of the four it misses, two add a reason or implication the passage does not state ("This is because prolonged exposure ... degrades the battery's life"; "it implies that any object ..."), and two were labelled unsupported because they do not answer the question asked, although their facts are in the passage. Strict catches almost everything but flags about one correct sentence in five. The application therefore uses balanced by default and offers strict as a per-user setting (profile page). The experiments in 6.1–6.5 were measured with the original </w:t>
+      </w:r>
+      <w:r>
+        <w:rPr>
+          <w:rFonts w:ascii="Consolas" w:hAnsi="Consolas"/>
+          <w:sz w:val="19"/>
+        </w:rPr>
+        <w:t>nli</w:t>
+      </w:r>
+      <w:r>
+        <w:t xml:space="preserve"> verifier.</w:t>
       </w:r>
     </w:p>
     <w:p>
@@ -14684,6 +15304,20 @@
       </w:r>
       <w:r>
         <w:t xml:space="preserve"> Questions, relevance labels and key facts were written by an AI assistant and audited by the same assistant, not checked by people. An independent test set and content-based labels limit, but do not remove, the risk of systematic labelling errors. Retrieval metrics and key-fact recall depend on them.</w:t>
+      </w:r>
+    </w:p>
+    <w:p>
+      <w:pPr>
+        <w:pStyle w:val="ListBullet"/>
+      </w:pPr>
+      <w:r>
+        <w:rPr>
+          <w:b/>
+        </w:rPr>
+        <w:t>Small local context window.</w:t>
+      </w:r>
+      <w:r>
+        <w:t xml:space="preserve"> Ollama ran Qwen3-8B with a 4,096-token context; the largest answer prompts (10 passages) reached about 3,800 tokens, close to the limit where text is silently dropped. No single-call run exceeded it (largest total 3,887).</w:t>
       </w:r>
     </w:p>
     <w:p>

</xml_diff>

<commit_message>
Report: system design and implementation brought up to date
Chapters 3 and 4 describe what was built after the experiments: sources used
for one answer (web, patent abstracts) and the routing table, the three-stage
verifier with balanced/strict modes and the attribution guard, small talk,
the single asking page, the GPU inference lock and make demo. Real counts
(47 API operations, 9 tools, 405 + 37 tests) replace a placeholder and stale
numbers; architecture diagram shows external sources and the new verifier.

Co-Authored-By: Claude Opus 5.5 <noreply@anthropic.com>
</commit_message>
<xml_diff>
--- a/docs/report/Project_Report.docx
+++ b/docs/report/Project_Report.docx
@@ -427,7 +427,7 @@
       <w:r>
         <w:drawing>
           <wp:inline xmlns:a="http://schemas.openxmlformats.org/drawingml/2006/main" xmlns:pic="http://schemas.openxmlformats.org/drawingml/2006/picture">
-            <wp:extent cx="5669280" cy="2972829"/>
+            <wp:extent cx="5669280" cy="3500780"/>
             <wp:docPr id="1" name="Picture 1"/>
             <wp:cNvGraphicFramePr>
               <a:graphicFrameLocks noChangeAspect="1"/>
@@ -448,7 +448,7 @@
                   <pic:spPr>
                     <a:xfrm>
                       <a:off x="0" y="0"/>
-                      <a:ext cx="5669280" cy="2972829"/>
+                      <a:ext cx="5669280" cy="3500780"/>
                     </a:xfrm>
                     <a:prstGeom prst="rect"/>
                   </pic:spPr>
@@ -594,7 +594,7 @@
               <w:rPr>
                 <w:sz w:val="17"/>
               </w:rPr>
-              <w:t xml:space="preserve">Pages for documents, questions, patent search, comparison, evaluation, settings; proxies </w:t>
+              <w:t xml:space="preserve">One asking page (a chat that opens on a search-style start screen), Library, Invention analysis, Patent watch, research pages; proxies </w:t>
             </w:r>
             <w:r>
               <w:rPr>
@@ -663,7 +663,7 @@
               <w:rPr>
                 <w:sz w:val="17"/>
               </w:rPr>
-              <w:t>21 endpoints; validation, rate and size limits, uniform JSON errors with request IDs</w:t>
+              <w:t>47 operations; validation, rate and size limits, uniform JSON errors with request IDs</w:t>
             </w:r>
           </w:p>
         </w:tc>
@@ -831,7 +831,7 @@
               <w:rPr>
                 <w:sz w:val="17"/>
               </w:rPr>
-              <w:t>Generation, embeddings, verification, optional reranking</w:t>
+              <w:t>Generation, embeddings, verification (NLI, with an LLM second opinion), optional reranking</w:t>
             </w:r>
           </w:p>
         </w:tc>
@@ -869,7 +869,7 @@
               <w:rPr>
                 <w:sz w:val="17"/>
               </w:rPr>
-              <w:t>EPO OPS v3.2</w:t>
+              <w:t>EPO OPS v3.2; Tavily or Wikipedia</w:t>
             </w:r>
           </w:p>
         </w:tc>
@@ -887,7 +887,7 @@
               <w:rPr>
                 <w:sz w:val="17"/>
               </w:rPr>
-              <w:t>Search, bibliographic data, claims and descriptions of published patents</w:t>
+              <w:t>Patent search, bibliographic data, claims and descriptions; web search for general questions</w:t>
             </w:r>
           </w:p>
         </w:tc>
@@ -1003,7 +1003,7 @@
         <w:t>Analyse:</w:t>
       </w:r>
       <w:r>
-        <w:t xml:space="preserve"> classify intent (document question, patent lookup, find similar, compare) and extract publication numbers, claim numbers, sections and legal wording, using rules or an LLM planner whose output is validated (numbers, sections and the similar-search intent are only accepted if the question contains them).</w:t>
+        <w:t xml:space="preserve"> recognise small talk ("hello", "thanks"), which gets a short reply with no retrieval; otherwise classify intent (document question, patent lookup, find similar, compare) and extract publication numbers, claim numbers, sections and legal wording, using rules or an LLM planner whose output is validated (numbers, sections and the similar-search intent are only accepted if the question contains them).</w:t>
       </w:r>
     </w:p>
     <w:p>
@@ -1101,6 +1101,26 @@
         <w:t>extract_key_concepts</w:t>
       </w:r>
       <w:r>
+        <w:t xml:space="preserve">, </w:t>
+      </w:r>
+      <w:r>
+        <w:rPr>
+          <w:rFonts w:ascii="Consolas" w:hAnsi="Consolas"/>
+          <w:sz w:val="19"/>
+        </w:rPr>
+        <w:t>search_web</w:t>
+      </w:r>
+      <w:r>
+        <w:t xml:space="preserve">, </w:t>
+      </w:r>
+      <w:r>
+        <w:rPr>
+          <w:rFonts w:ascii="Consolas" w:hAnsi="Consolas"/>
+          <w:sz w:val="19"/>
+        </w:rPr>
+        <w:t>search_patent_abstracts</w:t>
+      </w:r>
+      <w:r>
         <w:t>.</w:t>
       </w:r>
     </w:p>
@@ -1115,7 +1135,7 @@
         <w:t>Check and recover:</w:t>
       </w:r>
       <w:r>
-        <w:t xml:space="preserve"> if evidence is insufficient, one recovery step broadens the search.</w:t>
+        <w:t xml:space="preserve"> if evidence is insufficient, one recovery step broadens the search; if the library has no answer (or the model reads its passages and replies "insufficient evidence"), the web and patent offices are searched once (Section 3.4.1).</w:t>
       </w:r>
     </w:p>
     <w:p>
@@ -1208,6 +1228,277 @@
     </w:p>
     <w:p>
       <w:pPr>
+        <w:pStyle w:val="Heading3"/>
+      </w:pPr>
+      <w:r>
+        <w:t>3.4.1 Sources used for one answer (added after the experiments)</w:t>
+      </w:r>
+    </w:p>
+    <w:p>
+      <w:r>
+        <w:t>To behave like a general assistant without giving up verification, questions that are not about the user's own documents also draw on outside sources, used for that answer only:</w:t>
+      </w:r>
+    </w:p>
+    <w:tbl>
+      <w:tblPr>
+        <w:tblStyle w:val="TableGrid"/>
+        <w:tblW w:type="auto" w:w="0"/>
+        <w:tblLook w:firstColumn="1" w:firstRow="1" w:lastColumn="0" w:lastRow="0" w:noHBand="0" w:noVBand="1" w:val="04A0"/>
+      </w:tblPr>
+      <w:tblGrid>
+        <w:gridCol w:w="4320"/>
+        <w:gridCol w:w="4320"/>
+      </w:tblGrid>
+      <w:tr>
+        <w:tc>
+          <w:tcPr>
+            <w:tcW w:type="dxa" w:w="4320"/>
+          </w:tcPr>
+          <w:p>
+            <w:r>
+              <w:rPr>
+                <w:b/>
+                <w:sz w:val="17"/>
+              </w:rPr>
+            </w:r>
+            <w:r>
+              <w:rPr>
+                <w:b/>
+                <w:sz w:val="17"/>
+              </w:rPr>
+              <w:t>Question</w:t>
+            </w:r>
+          </w:p>
+        </w:tc>
+        <w:tc>
+          <w:tcPr>
+            <w:tcW w:type="dxa" w:w="4320"/>
+          </w:tcPr>
+          <w:p>
+            <w:r>
+              <w:rPr>
+                <w:b/>
+                <w:sz w:val="17"/>
+              </w:rPr>
+            </w:r>
+            <w:r>
+              <w:rPr>
+                <w:b/>
+                <w:sz w:val="17"/>
+              </w:rPr>
+              <w:t>Sources searched</w:t>
+            </w:r>
+          </w:p>
+        </w:tc>
+      </w:tr>
+      <w:tr>
+        <w:tc>
+          <w:tcPr>
+            <w:tcW w:type="dxa" w:w="4320"/>
+          </w:tcPr>
+          <w:p>
+            <w:r>
+              <w:rPr>
+                <w:sz w:val="17"/>
+              </w:rPr>
+            </w:r>
+            <w:r>
+              <w:rPr>
+                <w:sz w:val="17"/>
+              </w:rPr>
+              <w:t>About attached or named documents</w:t>
+            </w:r>
+          </w:p>
+        </w:tc>
+        <w:tc>
+          <w:tcPr>
+            <w:tcW w:type="dxa" w:w="4320"/>
+          </w:tcPr>
+          <w:p>
+            <w:r>
+              <w:rPr>
+                <w:sz w:val="17"/>
+              </w:rPr>
+            </w:r>
+            <w:r>
+              <w:rPr>
+                <w:sz w:val="17"/>
+              </w:rPr>
+              <w:t>Those documents only</w:t>
+            </w:r>
+          </w:p>
+        </w:tc>
+      </w:tr>
+      <w:tr>
+        <w:tc>
+          <w:tcPr>
+            <w:tcW w:type="dxa" w:w="4320"/>
+          </w:tcPr>
+          <w:p>
+            <w:r>
+              <w:rPr>
+                <w:sz w:val="17"/>
+              </w:rPr>
+            </w:r>
+            <w:r>
+              <w:rPr>
+                <w:sz w:val="17"/>
+              </w:rPr>
+              <w:t>General ("How do solid-state batteries work?")</w:t>
+            </w:r>
+          </w:p>
+        </w:tc>
+        <w:tc>
+          <w:tcPr>
+            <w:tcW w:type="dxa" w:w="4320"/>
+          </w:tcPr>
+          <w:p>
+            <w:r>
+              <w:rPr>
+                <w:sz w:val="17"/>
+              </w:rPr>
+            </w:r>
+            <w:r>
+              <w:rPr>
+                <w:sz w:val="17"/>
+              </w:rPr>
+              <w:t>Library + web</w:t>
+            </w:r>
+          </w:p>
+        </w:tc>
+      </w:tr>
+      <w:tr>
+        <w:tc>
+          <w:tcPr>
+            <w:tcW w:type="dxa" w:w="4320"/>
+          </w:tcPr>
+          <w:p>
+            <w:r>
+              <w:rPr>
+                <w:sz w:val="17"/>
+              </w:rPr>
+            </w:r>
+            <w:r>
+              <w:rPr>
+                <w:sz w:val="17"/>
+              </w:rPr>
+              <w:t>About patents, or with the "Patent DBs" switch</w:t>
+            </w:r>
+          </w:p>
+        </w:tc>
+        <w:tc>
+          <w:tcPr>
+            <w:tcW w:type="dxa" w:w="4320"/>
+          </w:tcPr>
+          <w:p>
+            <w:r>
+              <w:rPr>
+                <w:sz w:val="17"/>
+              </w:rPr>
+            </w:r>
+            <w:r>
+              <w:rPr>
+                <w:sz w:val="17"/>
+              </w:rPr>
+              <w:t>Library + web + patent-office abstracts</w:t>
+            </w:r>
+          </w:p>
+        </w:tc>
+      </w:tr>
+      <w:tr>
+        <w:tc>
+          <w:tcPr>
+            <w:tcW w:type="dxa" w:w="4320"/>
+          </w:tcPr>
+          <w:p>
+            <w:r>
+              <w:rPr>
+                <w:sz w:val="17"/>
+              </w:rPr>
+            </w:r>
+            <w:r>
+              <w:rPr>
+                <w:sz w:val="17"/>
+              </w:rPr>
+              <w:t>Topic search ("latest patents on X")</w:t>
+            </w:r>
+          </w:p>
+        </w:tc>
+        <w:tc>
+          <w:tcPr>
+            <w:tcW w:type="dxa" w:w="4320"/>
+          </w:tcPr>
+          <w:p>
+            <w:r>
+              <w:rPr>
+                <w:sz w:val="17"/>
+              </w:rPr>
+            </w:r>
+            <w:r>
+              <w:rPr>
+                <w:sz w:val="17"/>
+              </w:rPr>
+              <w:t>Patent-office abstracts</w:t>
+            </w:r>
+          </w:p>
+        </w:tc>
+      </w:tr>
+      <w:tr>
+        <w:tc>
+          <w:tcPr>
+            <w:tcW w:type="dxa" w:w="4320"/>
+          </w:tcPr>
+          <w:p>
+            <w:r>
+              <w:rPr>
+                <w:sz w:val="17"/>
+              </w:rPr>
+            </w:r>
+            <w:r>
+              <w:rPr>
+                <w:sz w:val="17"/>
+              </w:rPr>
+              <w:t>A named patent; "similar to my invention"</w:t>
+            </w:r>
+          </w:p>
+        </w:tc>
+        <w:tc>
+          <w:tcPr>
+            <w:tcW w:type="dxa" w:w="4320"/>
+          </w:tcPr>
+          <w:p>
+            <w:r>
+              <w:rPr>
+                <w:sz w:val="17"/>
+              </w:rPr>
+            </w:r>
+            <w:r>
+              <w:rPr>
+                <w:sz w:val="17"/>
+              </w:rPr>
+              <w:t>Patent imported (full text needed)</w:t>
+            </w:r>
+          </w:p>
+        </w:tc>
+      </w:tr>
+    </w:tbl>
+    <w:p/>
+    <w:p>
+      <w:r>
+        <w:t xml:space="preserve">Web pages (Tavily, or Wikipedia when no key is configured) and patent-office hits (title and abstract) become </w:t>
+      </w:r>
+      <w:r>
+        <w:rPr>
+          <w:i/>
+        </w:rPr>
+        <w:t>transient passages</w:t>
+      </w:r>
+      <w:r>
+        <w:t>: ranked by embedding similarity to the question, dropped below a similarity of 0.55, cited and verified exactly like library passages, recorded in the run, but never stored in the library or indexed. A question the LLM planner judges off-topic may use the web but not the patent offices. Web and EPO requests retry once after a dropped connection, and an answer says when its sources could not be reached rather than that nothing exists. All of this is switched off in the experiments (Chapter 6 measured the system without it).</w:t>
+      </w:r>
+    </w:p>
+    <w:p>
+      <w:pPr>
         <w:pStyle w:val="Heading2"/>
       </w:pPr>
       <w:r>
@@ -1230,7 +1521,65 @@
     </w:p>
     <w:p>
       <w:r>
-        <w:t>The NLI judgement (Figure 3.5) scores the passage, each of its sentences and each pair of neighbouring sentences, prefixed with the passage's location, and takes the maximum entailment probability (≥ 0.5 supported, ≥ 0.15 partial).</w:t>
+        <w:t>The NLI judgement (Figure 3.5) scores the passage, each of its sentences and each pair of neighbouring sentences, prefixed with the passage's location and document title, and takes the maximum entailment probability (≥ 0.5 supported, ≥ 0.15 partial).</w:t>
+      </w:r>
+    </w:p>
+    <w:p>
+      <w:r>
+        <w:rPr>
+          <w:b/>
+        </w:rPr>
+        <w:t>After the experiments</w:t>
+      </w:r>
+      <w:r>
+        <w:t>, users saw correct sentences flagged (Section 6.6), and the application now verifies in up to three stages:</w:t>
+      </w:r>
+    </w:p>
+    <w:p>
+      <w:pPr>
+        <w:pStyle w:val="ListNumber"/>
+      </w:pPr>
+      <w:r>
+        <w:rPr>
+          <w:b/>
+        </w:rPr>
+        <w:t>NLI</w:t>
+      </w:r>
+      <w:r>
+        <w:t>, as above.</w:t>
+      </w:r>
+    </w:p>
+    <w:p>
+      <w:pPr>
+        <w:pStyle w:val="ListNumber"/>
+      </w:pPr>
+      <w:r>
+        <w:rPr>
+          <w:b/>
+        </w:rPr>
+        <w:t>Guarded word-overlap rescue</w:t>
+      </w:r>
+      <w:r>
+        <w:t xml:space="preserve"> of what NLI rejects: a statement counts as supported if at least 75% of its key words appear in one passage, all its numbers appear there, and it adds no negation or opposite direction word ("increases" vs. "decreases").</w:t>
+      </w:r>
+    </w:p>
+    <w:p>
+      <w:pPr>
+        <w:pStyle w:val="ListNumber"/>
+      </w:pPr>
+      <w:r>
+        <w:rPr>
+          <w:b/>
+        </w:rPr>
+        <w:t>LLM second opinion</w:t>
+      </w:r>
+      <w:r>
+        <w:t xml:space="preserve"> ("balanced", the default): only statements still flagged are re-checked by Qwen3-8B (batches of four, three most relevant passages each), which accepts synonyms but not added reasons or implications. "Strict" mode, a per-user setting, stops after stage 2.</w:t>
+      </w:r>
+    </w:p>
+    <w:p>
+      <w:r>
+        <w:t>Two rules apply in every mode. A statement that names a patent number cannot be supported by a passage from a different patent. An uncited statement that a passage supports counts as supported (citation coverage is reported separately). Chapter 6 reports the original NLI verifier; Section 6.6 measures the new stages.</w:t>
       </w:r>
     </w:p>
     <w:p>
@@ -1940,6 +2289,174 @@
           </w:p>
         </w:tc>
       </w:tr>
+      <w:tr>
+        <w:tc>
+          <w:tcPr>
+            <w:tcW w:type="dxa" w:w="2880"/>
+          </w:tcPr>
+          <w:p>
+            <w:r>
+              <w:rPr>
+                <w:sz w:val="17"/>
+              </w:rPr>
+            </w:r>
+            <w:r>
+              <w:rPr>
+                <w:sz w:val="17"/>
+              </w:rPr>
+              <w:t>LLM only as a second opinion on flagged statements</w:t>
+            </w:r>
+          </w:p>
+        </w:tc>
+        <w:tc>
+          <w:tcPr>
+            <w:tcW w:type="dxa" w:w="2880"/>
+          </w:tcPr>
+          <w:p>
+            <w:r>
+              <w:rPr>
+                <w:sz w:val="17"/>
+              </w:rPr>
+            </w:r>
+            <w:r>
+              <w:rPr>
+                <w:sz w:val="17"/>
+              </w:rPr>
+              <w:t>LLM judges everything</w:t>
+            </w:r>
+          </w:p>
+        </w:tc>
+        <w:tc>
+          <w:tcPr>
+            <w:tcW w:type="dxa" w:w="2880"/>
+          </w:tcPr>
+          <w:p>
+            <w:r>
+              <w:rPr>
+                <w:sz w:val="17"/>
+              </w:rPr>
+            </w:r>
+            <w:r>
+              <w:rPr>
+                <w:sz w:val="17"/>
+              </w:rPr>
+              <w:t>Cost proportional to doubt; the LLM alone accepted plausible but unstated reasons (Section 6.6)</w:t>
+            </w:r>
+          </w:p>
+        </w:tc>
+      </w:tr>
+      <w:tr>
+        <w:tc>
+          <w:tcPr>
+            <w:tcW w:type="dxa" w:w="2880"/>
+          </w:tcPr>
+          <w:p>
+            <w:r>
+              <w:rPr>
+                <w:sz w:val="17"/>
+              </w:rPr>
+            </w:r>
+            <w:r>
+              <w:rPr>
+                <w:sz w:val="17"/>
+              </w:rPr>
+              <w:t>Web pages and abstracts used for one answer</w:t>
+            </w:r>
+          </w:p>
+        </w:tc>
+        <w:tc>
+          <w:tcPr>
+            <w:tcW w:type="dxa" w:w="2880"/>
+          </w:tcPr>
+          <w:p>
+            <w:r>
+              <w:rPr>
+                <w:sz w:val="17"/>
+              </w:rPr>
+            </w:r>
+            <w:r>
+              <w:rPr>
+                <w:sz w:val="17"/>
+              </w:rPr>
+              <w:t>Import everything found</w:t>
+            </w:r>
+          </w:p>
+        </w:tc>
+        <w:tc>
+          <w:tcPr>
+            <w:tcW w:type="dxa" w:w="2880"/>
+          </w:tcPr>
+          <w:p>
+            <w:r>
+              <w:rPr>
+                <w:sz w:val="17"/>
+              </w:rPr>
+            </w:r>
+            <w:r>
+              <w:rPr>
+                <w:sz w:val="17"/>
+              </w:rPr>
+              <w:t>Fast, no library clutter, and still cited and verified; full import only when full text is needed</w:t>
+            </w:r>
+          </w:p>
+        </w:tc>
+      </w:tr>
+      <w:tr>
+        <w:tc>
+          <w:tcPr>
+            <w:tcW w:type="dxa" w:w="2880"/>
+          </w:tcPr>
+          <w:p>
+            <w:r>
+              <w:rPr>
+                <w:sz w:val="17"/>
+              </w:rPr>
+            </w:r>
+            <w:r>
+              <w:rPr>
+                <w:sz w:val="17"/>
+              </w:rPr>
+              <w:t>Web answers from cited pages</w:t>
+            </w:r>
+          </w:p>
+        </w:tc>
+        <w:tc>
+          <w:tcPr>
+            <w:tcW w:type="dxa" w:w="2880"/>
+          </w:tcPr>
+          <w:p>
+            <w:r>
+              <w:rPr>
+                <w:sz w:val="17"/>
+              </w:rPr>
+            </w:r>
+            <w:r>
+              <w:rPr>
+                <w:sz w:val="17"/>
+              </w:rPr>
+              <w:t>Model's own knowledge</w:t>
+            </w:r>
+          </w:p>
+        </w:tc>
+        <w:tc>
+          <w:tcPr>
+            <w:tcW w:type="dxa" w:w="2880"/>
+          </w:tcPr>
+          <w:p>
+            <w:r>
+              <w:rPr>
+                <w:sz w:val="17"/>
+              </w:rPr>
+            </w:r>
+            <w:r>
+              <w:rPr>
+                <w:sz w:val="17"/>
+              </w:rPr>
+              <w:t>Only sources can be verified; Experiment E showed the model inventing details about unseen patents</w:t>
+            </w:r>
+          </w:p>
+        </w:tc>
+      </w:tr>
     </w:tbl>
     <w:p/>
     <w:p>
@@ -1965,7 +2482,7 @@
     </w:p>
     <w:p>
       <w:r>
-        <w:t>The system was built in thirteen phases (0–12), each ending with automated tests and a manual check with real models. The backend has [311] automated tests (unit tests with fake models, and integration tests against a separate PostgreSQL test database rolled back after each test); the frontend has unit tests, type checks and linting, and pages were checked in a real browser.</w:t>
+        <w:t>The system was built in thirteen phases (0–12), each ending with automated tests and a manual check with real models, followed by improvements prompted by user testing (live and web search, verifier stages, a single asking page). The backend has 405 automated tests (unit tests with fake models, and integration tests against a separate PostgreSQL test database rolled back after each test); the frontend has 37 unit tests, type checks and linting, and pages were checked in a real browser. Tests never reach live services: patent-office credentials and web search are switched off in the test setup.</w:t>
       </w:r>
     </w:p>
     <w:p>
@@ -2101,7 +2618,7 @@
               <w:rPr>
                 <w:sz w:val="17"/>
               </w:rPr>
-              <w:t>query analysis (rules and LLM), seven tools, LangGraph agent</w:t>
+              <w:t>query analysis (rules and LLM, small talk), nine tools, LangGraph agent</w:t>
             </w:r>
           </w:p>
         </w:tc>
@@ -2140,7 +2657,7 @@
               <w:rPr>
                 <w:sz w:val="17"/>
               </w:rPr>
-              <w:t>NLI, LLM-judge and lexical verifiers; claim extraction; two-pass checking</w:t>
+              <w:t>NLI, lexical and LLM-judge verifiers, NLI + lexical rescue, LLM second opinion, patent-number attribution guard; claim extraction; two-pass checking</w:t>
             </w:r>
           </w:p>
         </w:tc>
@@ -2161,7 +2678,7 @@
                 <w:rFonts w:ascii="Consolas" w:hAnsi="Consolas"/>
                 <w:sz w:val="17"/>
               </w:rPr>
-              <w:t>invention/</w:t>
+              <w:t>web/</w:t>
             </w:r>
           </w:p>
         </w:tc>
@@ -2179,7 +2696,7 @@
               <w:rPr>
                 <w:sz w:val="17"/>
               </w:rPr>
-              <w:t>invention analysis: feature extraction, candidate ranking, feature chart, Markdown report</w:t>
+              <w:t>web search providers (Tavily, Wikipedia)</w:t>
             </w:r>
           </w:p>
         </w:tc>
@@ -2200,7 +2717,7 @@
                 <w:rFonts w:ascii="Consolas" w:hAnsi="Consolas"/>
                 <w:sz w:val="17"/>
               </w:rPr>
-              <w:t>intelligence/</w:t>
+              <w:t>invention/</w:t>
             </w:r>
           </w:p>
         </w:tc>
@@ -2218,7 +2735,7 @@
               <w:rPr>
                 <w:sz w:val="17"/>
               </w:rPr>
-              <w:t>patent family de-duplication, similarity ranking, structured comparison tables</w:t>
+              <w:t>invention analysis: feature extraction, candidate ranking, feature chart, Markdown report</w:t>
             </w:r>
           </w:p>
         </w:tc>
@@ -2239,7 +2756,7 @@
                 <w:rFonts w:ascii="Consolas" w:hAnsi="Consolas"/>
                 <w:sz w:val="17"/>
               </w:rPr>
-              <w:t>patents/</w:t>
+              <w:t>intelligence/</w:t>
             </w:r>
           </w:p>
         </w:tc>
@@ -2257,7 +2774,7 @@
               <w:rPr>
                 <w:sz w:val="17"/>
               </w:rPr>
-              <w:t>EPO OPS client (OAuth, CQL search, full text), demo source, response cache</w:t>
+              <w:t>patent family de-duplication, similarity ranking, structured comparison tables</w:t>
             </w:r>
           </w:p>
         </w:tc>
@@ -2278,7 +2795,7 @@
                 <w:rFonts w:ascii="Consolas" w:hAnsi="Consolas"/>
                 <w:sz w:val="17"/>
               </w:rPr>
-              <w:t>evaluation/</w:t>
+              <w:t>patents/</w:t>
             </w:r>
           </w:p>
         </w:tc>
@@ -2296,7 +2813,7 @@
               <w:rPr>
                 <w:sz w:val="17"/>
               </w:rPr>
-              <w:t>dataset format, metrics, scoring, experiment runner, verifier evaluation, reports</w:t>
+              <w:t>EPO OPS client (OAuth, CQL search, full text), demo source, response cache</w:t>
             </w:r>
           </w:p>
         </w:tc>
@@ -2317,20 +2834,7 @@
                 <w:rFonts w:ascii="Consolas" w:hAnsi="Consolas"/>
                 <w:sz w:val="17"/>
               </w:rPr>
-              <w:t>services/</w:t>
-            </w:r>
-            <w:r>
-              <w:rPr>
-                <w:sz w:val="17"/>
-              </w:rPr>
-              <w:t xml:space="preserve">, </w:t>
-            </w:r>
-            <w:r>
-              <w:rPr>
-                <w:rFonts w:ascii="Consolas" w:hAnsi="Consolas"/>
-                <w:sz w:val="17"/>
-              </w:rPr>
-              <w:t>api/</w:t>
+              <w:t>evaluation/</w:t>
             </w:r>
           </w:p>
         </w:tc>
@@ -2348,7 +2852,7 @@
               <w:rPr>
                 <w:sz w:val="17"/>
               </w:rPr>
-              <w:t>baseline and agentic answer services, documents, patents, comparison; HTTP routes</w:t>
+              <w:t>dataset format, metrics, scoring, experiment runner, verifier evaluation, reports</w:t>
             </w:r>
           </w:p>
         </w:tc>
@@ -2369,6 +2873,58 @@
                 <w:rFonts w:ascii="Consolas" w:hAnsi="Consolas"/>
                 <w:sz w:val="17"/>
               </w:rPr>
+              <w:t>services/</w:t>
+            </w:r>
+            <w:r>
+              <w:rPr>
+                <w:sz w:val="17"/>
+              </w:rPr>
+              <w:t xml:space="preserve">, </w:t>
+            </w:r>
+            <w:r>
+              <w:rPr>
+                <w:rFonts w:ascii="Consolas" w:hAnsi="Consolas"/>
+                <w:sz w:val="17"/>
+              </w:rPr>
+              <w:t>api/</w:t>
+            </w:r>
+          </w:p>
+        </w:tc>
+        <w:tc>
+          <w:tcPr>
+            <w:tcW w:type="dxa" w:w="4320"/>
+          </w:tcPr>
+          <w:p>
+            <w:r>
+              <w:rPr>
+                <w:sz w:val="17"/>
+              </w:rPr>
+            </w:r>
+            <w:r>
+              <w:rPr>
+                <w:sz w:val="17"/>
+              </w:rPr>
+              <w:t>baseline and agentic answer services, documents, patents, comparison; HTTP routes</w:t>
+            </w:r>
+          </w:p>
+        </w:tc>
+      </w:tr>
+      <w:tr>
+        <w:tc>
+          <w:tcPr>
+            <w:tcW w:type="dxa" w:w="4320"/>
+          </w:tcPr>
+          <w:p>
+            <w:r>
+              <w:rPr>
+                <w:sz w:val="17"/>
+              </w:rPr>
+            </w:r>
+            <w:r>
+              <w:rPr>
+                <w:rFonts w:ascii="Consolas" w:hAnsi="Consolas"/>
+                <w:sz w:val="17"/>
+              </w:rPr>
               <w:t>core/</w:t>
             </w:r>
           </w:p>
@@ -2387,7 +2943,7 @@
               <w:rPr>
                 <w:sz w:val="17"/>
               </w:rPr>
-              <w:t>configuration, logging with secret redaction, errors, security middleware</w:t>
+              <w:t>configuration, logging with secret redaction, errors, security middleware, one lock around all local model inference</w:t>
             </w:r>
           </w:p>
         </w:tc>
@@ -2513,7 +3069,29 @@
         <w:t>cross-encoder/nli-deberta-v3-xsmall</w:t>
       </w:r>
       <w:r>
-        <w:t xml:space="preserve"> (about 280 MB, runs on CPU); label order is read from the model configuration.</w:t>
+        <w:t>; label order is read from the model configuration.</w:t>
+      </w:r>
+    </w:p>
+    <w:p>
+      <w:r>
+        <w:rPr>
+          <w:b/>
+        </w:rPr>
+        <w:t>Transient passages.</w:t>
+      </w:r>
+      <w:r>
+        <w:t xml:space="preserve"> Web results and patent-office hits are wrapped in an object that behaves like a stored passage for generation and verification (text, section, source label, link) but has no database row; run records keep their text without a chunk link, and the answer's evidence lists their site or publication number and URL.</w:t>
+      </w:r>
+    </w:p>
+    <w:p>
+      <w:r>
+        <w:rPr>
+          <w:b/>
+        </w:rPr>
+        <w:t>Model inference on the GPU.</w:t>
+      </w:r>
+      <w:r>
+        <w:t xml:space="preserve"> On Apple silicon, PyTorch's MPS backend aborted the whole process when two requests ran models at once (reproduced with six concurrent threads). One process-wide lock now serialises every embedding, reranking and NLI call; requests wait a moment instead of crashing.</w:t>
       </w:r>
     </w:p>
     <w:p>
@@ -2548,7 +3126,7 @@
     </w:p>
     <w:p>
       <w:r>
-        <w:t xml:space="preserve">The UI is built around a chat, like the assistants users already know. After login, a sidebar lists the user's conversations (grouped by date, renamable) and three tools: </w:t>
+        <w:t xml:space="preserve">The UI is built around one asking page, like the assistants users already know. A new chat opens on a search-style start screen (greeting, a large question box with attach and "Patent DBs" controls, suggested questions, shortcuts to the tools) and becomes a conversation once a question is asked, with the box docked below. After login, a sidebar lists the user's conversations (grouped by date, renamable) and three tools: </w:t>
       </w:r>
       <w:r>
         <w:rPr>
@@ -2575,7 +3153,7 @@
         <w:t>Patent watch</w:t>
       </w:r>
       <w:r>
-        <w:t xml:space="preserve"> (new-publication alerts with an unread badge). A chat answers with clickable citations and a one-line trust summary ("5 of 6 statements verified"); sources, sentence checks and the agent's steps open on demand. Files are attached by drag-and-drop or the paperclip, and any library item opens a chat with it attached. Follow-ups are shown with the standalone question the system understood. Research pages (Evaluation results with confidence intervals, a Research console exposing every retrieval option, System status) sit in the user menu, with the profile and the light/dark theme. API types are generated from the backend's OpenAPI schema.</w:t>
+        <w:t xml:space="preserve"> (new-publication alerts with an unread badge). A chat answers with clickable citations and a one-line trust summary ("5 of 6 statements verified"); sources (documents, patents and web pages, each with a link), sentence checks and the agent's steps open on demand. Greetings get a short reply without retrieval. Files are attached by drag-and-drop or the paperclip, and any library item opens a chat with it attached. Follow-ups are shown with the standalone question the system understood. Research pages (Evaluation results with confidence intervals, a Research console exposing every retrieval option, System status) sit in the user menu, with the profile (including the balanced/strict hallucination-check setting) and the light/dark theme. API types are generated from the backend's OpenAPI schema.</w:t>
       </w:r>
     </w:p>
     <w:p>
@@ -2608,7 +3186,17 @@
         <w:t>SecretStr</w:t>
       </w:r>
       <w:r>
-        <w:t>, never logged or sent to the browser); uploads are validated by content, size-limited while streaming and checked for zip bombs; rate limits cap LLM-backed requests; security headers and a Content-Security-Policy protect the UI; production start-up refuses unsafe settings. Docker images (non-root, health checks) run the full stack with one command. Details and remaining risks: docs/security.md.</w:t>
+        <w:t xml:space="preserve">, never logged or sent to the browser); uploads are validated by content, size-limited while streaming and checked for zip bombs; rate limits cap LLM-backed requests; security headers and a Content-Security-Policy protect the UI; production start-up refuses unsafe settings. Docker images (non-root, health checks) run the full stack with one command; on a laptop, </w:t>
+      </w:r>
+      <w:r>
+        <w:rPr>
+          <w:rFonts w:ascii="Consolas" w:hAnsi="Consolas"/>
+          <w:sz w:val="19"/>
+        </w:rPr>
+        <w:t>make demo</w:t>
+      </w:r>
+      <w:r>
+        <w:t xml:space="preserve"> starts the API and UI with the local models. Details and remaining risks: docs/security.md.</w:t>
       </w:r>
     </w:p>
     <w:p>

</xml_diff>